<commit_message>
Regenerate the main-text tables and figures deliverable
Rebuild the manifest and the tables/figures document so they carry the
same data as the reassembled manuscript.

Co-Authored-By: Claude Opus 5 <noreply@anthropic.com>
Claude-Session: https://claude.ai/code/session_01CuLT4FKRBtsU22Vwfjj2qn
</commit_message>
<xml_diff>
--- a/meta_agents/search_v2/outputs/Main_Text_Tables_Figures.docx
+++ b/meta_agents/search_v2/outputs/Main_Text_Tables_Figures.docx
@@ -652,7 +652,7 @@
                 <w:sz w:val="15"/>
                 <w:szCs w:val="15"/>
               </w:rPr>
-              <w:t xml:space="preserve">Low</w:t>
+              <w:t xml:space="preserve">Moderate</w:t>
             </w:r>
           </w:p>
         </w:tc>
@@ -3556,7 +3556,7 @@
                 <w:sz w:val="15"/>
                 <w:szCs w:val="15"/>
               </w:rPr>
-              <w:t xml:space="preserve">Low</w:t>
+              <w:t xml:space="preserve">Moderate</w:t>
             </w:r>
           </w:p>
         </w:tc>
@@ -3696,7 +3696,7 @@
                 <w:sz w:val="15"/>
                 <w:szCs w:val="15"/>
               </w:rPr>
-              <w:t xml:space="preserve">Low</w:t>
+              <w:t xml:space="preserve">Moderate</w:t>
             </w:r>
           </w:p>
         </w:tc>
@@ -3836,7 +3836,7 @@
                 <w:sz w:val="15"/>
                 <w:szCs w:val="15"/>
               </w:rPr>
-              <w:t xml:space="preserve">Low</w:t>
+              <w:t xml:space="preserve">Moderate</w:t>
             </w:r>
           </w:p>
         </w:tc>
@@ -3976,7 +3976,7 @@
                 <w:sz w:val="15"/>
                 <w:szCs w:val="15"/>
               </w:rPr>
-              <w:t xml:space="preserve">Low</w:t>
+              <w:t xml:space="preserve">Moderate</w:t>
             </w:r>
           </w:p>
         </w:tc>

</xml_diff>